<commit_message>
JOTE manuscript draft 4: MiniGrid 2023 citation
</commit_message>
<xml_diff>
--- a/docs/manuscript/manuscript.docx
+++ b/docs/manuscript/manuscript.docx
@@ -188,7 +188,7 @@
         <w:pStyle w:val="BodyText"/>
       </w:pPr>
       <w:r>
-        <w:t xml:space="preserve">I developed the census on eight of the 25 public ARC-AGI-3 games and kept the other 17 as a held-out set whose source code I never opened. The split is fixed in a file of the repository. That file held 18 games in the held-out set until 21 September 2026, when I moved one of them, dc22, to the development set to debug the agent’s wall learning on it, before any detailed study of the game. The reason for a fixed split is the problem of holdout reuse: when the same held-out set is consulted again and again while choices are made, choices can come to fit it (Blum &amp; Hardt, 2015). Roelofs et al. (2019) measured this effect across many machine learning competitions and found little of it. The two further suites, MiniGrid/BabyAI (Chevalier-Boisvert et al., 2019) and Procgen (Cobbe et al., 2020), were chosen to test whether the census transfers to games it was never tuned on.</w:t>
+        <w:t xml:space="preserve">I developed the census on eight of the 25 public ARC-AGI-3 games and kept the other 17 as a held-out set whose source code I never opened. The split is fixed in a file of the repository. That file held 18 games in the held-out set until 21 September 2026, when I moved one of them, dc22, to the development set to debug the agent’s wall learning on it, before any detailed study of the game. The reason for a fixed split is the problem of holdout reuse: when the same held-out set is consulted again and again while choices are made, choices can come to fit it (Blum &amp; Hardt, 2015). Roelofs et al. (2019) measured this effect across many machine learning competitions and found little of it. The two further suites, MiniGrid/BabyAI, which joins MiniGrid (Chevalier-Boisvert et al., 2023) and BabyAI (Chevalier-Boisvert et al., 2019), and Procgen (Cobbe et al., 2020), were chosen to test whether the census transfers to games it was never tuned on.</w:t>
       </w:r>
     </w:p>
     <w:p>
@@ -266,7 +266,7 @@
         <w:pStyle w:val="FirstParagraph"/>
       </w:pPr>
       <w:r>
-        <w:t xml:space="preserve">The frozen code presses six key identifiers only, so every suite is presented to it through a fixed key map of at most six actions. On MiniGrid/BabyAI (minigrid 3.1.0, gymnasium 1.3.0, Python 3.11.9) there are two conditions. Under primitive actions the keys are turn left, turn right, forward, pickup, drop and toggle. Under absolute moves they are north, south, west and east, each a turn to face that direction followed by a step forward, plus pickup and toggle. The action</w:t>
+        <w:t xml:space="preserve">The frozen code presses six key identifiers only, so every suite is presented to it through a fixed key map of at most six actions. On MiniGrid/BabyAI, the environments of MiniGrid (Chevalier-Boisvert et al., 2023) and BabyAI (Chevalier-Boisvert et al., 2019) run with minigrid 3.1.0, gymnasium 1.3.0 and Python 3.11.9, and there are two conditions. Under primitive actions the keys are turn left, turn right, forward, pickup, drop and toggle. Under absolute moves they are north, south, west and east, each a turn to face that direction followed by a step forward, plus pickup and toggle. The action</w:t>
       </w:r>
       <w:r>
         <w:t xml:space="preserve"> </w:t>
@@ -10259,7 +10259,7 @@
         <w:pStyle w:val="BodyText"/>
       </w:pPr>
       <w:r>
-        <w:t xml:space="preserve">Among agents for ARC-AGI-3, Rudakov et al. (2025) published the graph-based explorer used here as I1. Liew (2026) classifies the public games by the simplest strategy without reasoning that reaches a level. That classification concerns reachability rather than mechanics and makes no registered prediction. Skoutnev et al. (2026) identify goals with a coding agent built on a large pretrained model, which writes an executable world model of each game and so brings a learned prior; that places it outside the prior-free class for which G was defined. The two further suites are those of Chevalier-Boisvert et al. (2019) and Cobbe et al. (2020).</w:t>
+        <w:t xml:space="preserve">Among agents for ARC-AGI-3, Rudakov et al. (2025) published the graph-based explorer used here as I1. Liew (2026) classifies the public games by the simplest strategy without reasoning that reaches a level. That classification concerns reachability rather than mechanics and makes no registered prediction. Skoutnev et al. (2026) identify goals with a coding agent built on a large pretrained model, which writes an executable world model of each game and so brings a learned prior; that places it outside the prior-free class for which G was defined. The two further suites are those of Chevalier-Boisvert et al. (2023), Chevalier-Boisvert et al. (2019) and Cobbe et al. (2020).</w:t>
       </w:r>
     </w:p>
     <w:p>
@@ -10487,6 +10487,30 @@
       </w:r>
       <w:r>
         <w:t xml:space="preserve">. https://openreview.net/forum?id=rJeXCo0cYX</w:t>
+      </w:r>
+    </w:p>
+    <w:p>
+      <w:pPr>
+        <w:pStyle w:val="BodyText"/>
+      </w:pPr>
+      <w:r>
+        <w:t xml:space="preserve">Chevalier-Boisvert, M., Dai, B., Towers, M., Perez-Vicente, R., Willems, L., Lahlou, S., Pal, S., Castro, P. S., &amp; Terry, J. (2023). Minigrid &amp; Miniworld: Modular &amp; customizable reinforcement learning environments for goal-oriented tasks. In</w:t>
+      </w:r>
+      <w:r>
+        <w:t xml:space="preserve"> </w:t>
+      </w:r>
+      <w:r>
+        <w:rPr>
+          <w:i/>
+          <w:iCs/>
+        </w:rPr>
+        <w:t xml:space="preserve">Advances in Neural Information Processing Systems</w:t>
+      </w:r>
+      <w:r>
+        <w:t xml:space="preserve"> </w:t>
+      </w:r>
+      <w:r>
+        <w:t xml:space="preserve">(Vol. 36, pp. 73383–73394). https://doi.org/10.52202/075280-3209</w:t>
       </w:r>
     </w:p>
     <w:p>
@@ -12387,7 +12411,7 @@
               <w:pStyle w:val="Compact"/>
             </w:pPr>
             <w:r>
-              <w:t xml:space="preserve">docs/EXPLORATORY_V1_DIAGNOSIS.md (7d9205e); docs/GROUND_TRUTH_minigrid.md (f12e529); docs/GROUND_TRUTH_procgen.md (8d209b3); docs/HELDOUT.md (4d2c02c); docs/PREREG.md (7d9205e); docs/STATE.md (350f68b); docs/tables/v1.json (bb0f1a1); docs/tables/v2.json (bb0f1a1); runs/checks/determinism_check.json (5ac65c1); runs/exploratory/v1_diagnosis.json (66e5606); runs/pilot_checks/pilot_check.json (cda7aa0); runs/pilot_checks/procgen_camera_check.json (cda7aa0); scripts/analyze_common.py (a96e49e)</w:t>
+              <w:t xml:space="preserve">docs/EXPLORATORY_V1_DIAGNOSIS.md (7d9205e); docs/GROUND_TRUTH_minigrid.md (f12e529); docs/GROUND_TRUTH_procgen.md (8d209b3); docs/HELDOUT.md (4d2c02c); docs/PREREG.md (7d9205e); docs/STATE.md (687983a); docs/tables/v1.json (bb0f1a1); docs/tables/v2.json (bb0f1a1); runs/checks/determinism_check.json (5ac65c1); runs/exploratory/v1_diagnosis.json (66e5606); runs/pilot_checks/pilot_check.json (cda7aa0); runs/pilot_checks/procgen_camera_check.json (cda7aa0); scripts/analyze_common.py (a96e49e)</w:t>
             </w:r>
           </w:p>
         </w:tc>
@@ -12483,7 +12507,7 @@
               <w:pStyle w:val="Compact"/>
             </w:pPr>
             <w:r>
-              <w:t xml:space="preserve">docs/PREREG.md (7d9205e); docs/STATE.md (350f68b); git tag objects and git ls-tree (the tag objects themselves)</w:t>
+              <w:t xml:space="preserve">docs/PREREG.md (7d9205e); docs/STATE.md (687983a); git tag objects and git ls-tree (the tag objects themselves)</w:t>
             </w:r>
           </w:p>
         </w:tc>
@@ -12507,7 +12531,7 @@
               <w:pStyle w:val="Compact"/>
             </w:pPr>
             <w:r>
-              <w:t xml:space="preserve">docs/HELDOUT.md (4d2c02c); docs/PREREG.md (7d9205e); docs/STATE.md (350f68b); git tag objects and git ls-tree (the tag objects themselves)</w:t>
+              <w:t xml:space="preserve">docs/HELDOUT.md (4d2c02c); docs/PREREG.md (7d9205e); docs/STATE.md (687983a); git tag objects and git ls-tree (the tag objects themselves)</w:t>
             </w:r>
           </w:p>
         </w:tc>
@@ -12555,7 +12579,7 @@
               <w:pStyle w:val="Compact"/>
             </w:pPr>
             <w:r>
-              <w:t xml:space="preserve">docs/STATE.md (350f68b); docs/manuscript/REVIEW_draft1.md (48931d2); docs/preprint/preprint.md (8bed48b); docs/preprint/references.bib (8bed48b)</w:t>
+              <w:t xml:space="preserve">docs/STATE.md (687983a); docs/manuscript/REFERENCES_CHECK.md (changed in the commit that carries this table); docs/manuscript/REVIEW_draft1.md (48931d2); docs/preprint/preprint.md (8bed48b); docs/preprint/references.bib (8bed48b)</w:t>
             </w:r>
           </w:p>
         </w:tc>
@@ -12579,7 +12603,7 @@
               <w:pStyle w:val="Compact"/>
             </w:pPr>
             <w:r>
-              <w:t xml:space="preserve">docs/preprint/preprint.md (8bed48b); docs/preprint/references.bib (8bed48b); docs/tables/v1.json (bb0f1a1); docs/tables/v2.json (bb0f1a1)</w:t>
+              <w:t xml:space="preserve">docs/manuscript/REFERENCES_CHECK.md (changed in the commit that carries this table); docs/preprint/preprint.md (8bed48b); docs/preprint/references.bib (8bed48b); docs/tables/v1.json (bb0f1a1); docs/tables/v2.json (bb0f1a1)</w:t>
             </w:r>
           </w:p>
         </w:tc>

</xml_diff>

<commit_message>
Manuscript: wording and author-line fixes; rebuild
</commit_message>
<xml_diff>
--- a/docs/manuscript/manuscript.docx
+++ b/docs/manuscript/manuscript.docx
@@ -21,18 +21,6 @@
     <w:p>
       <w:pPr>
         <w:pStyle w:val="FirstParagraph"/>
-      </w:pPr>
-      <w:r>
-        <w:rPr>
-          <w:b/>
-          <w:bCs/>
-        </w:rPr>
-        <w:t xml:space="preserve">Rahul Kumar Mishra</w:t>
-      </w:r>
-    </w:p>
-    <w:p>
-      <w:pPr>
-        <w:pStyle w:val="BodyText"/>
       </w:pPr>
       <w:r>
         <w:t xml:space="preserve">Independent Researcher, Ranchi, Jharkhand, India</w:t>
@@ -10169,7 +10157,7 @@
         <w:pStyle w:val="FirstParagraph"/>
       </w:pPr>
       <w:r>
-        <w:t xml:space="preserve">The mistake, stated plainly and read from the exploratory diagnosis, is that the probes and the truth predicates were not the same constructs, and that no test existed where the parameters were set. The census decisions were by-products of one planner’s run: whether it located an avatar from its first presses, whether its first-level model mispredicted, whether it walked through a color it had called a wall, whether a recorded place ended a level again. The truth entries are properties of the environment’s step function. Only A1 is measured in nearly the same terms on both sides, and only A1 had no failing V1 line. I wrote the truth definitions and the census rules separately, each with care, and never checked on any game, before registration, that one estimated the other.</w:t>
+        <w:t xml:space="preserve">The mistake, stated plainly and read from the exploratory diagnosis, is that the probes and the truth predicates were not the same constructs, and that no test existed where the parameters were set. The census decisions were by-products of one planner’s run: whether it located an avatar from its first presses, whether its first-level model mispredicted, whether it walked through a color it had called a wall, whether a recorded place ended a level again. The truth entries are properties of the environment’s step function. Only A1 is measured in nearly the same terms on both sides, and only A1 had no failing V1 line. I wrote the truth definitions and the census rules separately and never checked on any game, before registration, that one estimated the other.</w:t>
       </w:r>
     </w:p>
     <w:p>
@@ -12579,7 +12567,7 @@
               <w:pStyle w:val="Compact"/>
             </w:pPr>
             <w:r>
-              <w:t xml:space="preserve">docs/STATE.md (687983a); docs/manuscript/REFERENCES_CHECK.md (changed in the commit that carries this table); docs/manuscript/REVIEW_draft1.md (48931d2); docs/preprint/preprint.md (8bed48b); docs/preprint/references.bib (8bed48b)</w:t>
+              <w:t xml:space="preserve">docs/STATE.md (687983a); docs/manuscript/REFERENCES_CHECK.md (6df6718); docs/manuscript/REVIEW_draft1.md (48931d2); docs/preprint/preprint.md (8bed48b); docs/preprint/references.bib (8bed48b)</w:t>
             </w:r>
           </w:p>
         </w:tc>
@@ -12603,7 +12591,7 @@
               <w:pStyle w:val="Compact"/>
             </w:pPr>
             <w:r>
-              <w:t xml:space="preserve">docs/manuscript/REFERENCES_CHECK.md (changed in the commit that carries this table); docs/preprint/preprint.md (8bed48b); docs/preprint/references.bib (8bed48b); docs/tables/v1.json (bb0f1a1); docs/tables/v2.json (bb0f1a1)</w:t>
+              <w:t xml:space="preserve">docs/manuscript/REFERENCES_CHECK.md (6df6718); docs/preprint/preprint.md (8bed48b); docs/preprint/references.bib (8bed48b); docs/tables/v1.json (bb0f1a1); docs/tables/v2.json (bb0f1a1)</w:t>
             </w:r>
           </w:p>
         </w:tc>

</xml_diff>

<commit_message>
Manuscript: Appendix C recopied; rebuild
</commit_message>
<xml_diff>
--- a/docs/manuscript/manuscript.docx
+++ b/docs/manuscript/manuscript.docx
@@ -12399,7 +12399,7 @@
               <w:pStyle w:val="Compact"/>
             </w:pPr>
             <w:r>
-              <w:t xml:space="preserve">docs/EXPLORATORY_V1_DIAGNOSIS.md (7d9205e); docs/GROUND_TRUTH_minigrid.md (f12e529); docs/GROUND_TRUTH_procgen.md (8d209b3); docs/HELDOUT.md (4d2c02c); docs/PREREG.md (7d9205e); docs/STATE.md (687983a); docs/tables/v1.json (bb0f1a1); docs/tables/v2.json (bb0f1a1); runs/checks/determinism_check.json (5ac65c1); runs/exploratory/v1_diagnosis.json (66e5606); runs/pilot_checks/pilot_check.json (cda7aa0); runs/pilot_checks/procgen_camera_check.json (cda7aa0); scripts/analyze_common.py (a96e49e)</w:t>
+              <w:t xml:space="preserve">docs/EXPLORATORY_V1_DIAGNOSIS.md (7d9205e); docs/GROUND_TRUTH_minigrid.md (f12e529); docs/GROUND_TRUTH_procgen.md (8d209b3); docs/HELDOUT.md (4d2c02c); docs/PREREG.md (7d9205e); docs/STATE.md (2048f36); docs/tables/v1.json (bb0f1a1); docs/tables/v2.json (bb0f1a1); runs/checks/determinism_check.json (5ac65c1); runs/exploratory/v1_diagnosis.json (66e5606); runs/pilot_checks/pilot_check.json (cda7aa0); runs/pilot_checks/procgen_camera_check.json (cda7aa0); scripts/analyze_common.py (a96e49e)</w:t>
             </w:r>
           </w:p>
         </w:tc>
@@ -12495,7 +12495,7 @@
               <w:pStyle w:val="Compact"/>
             </w:pPr>
             <w:r>
-              <w:t xml:space="preserve">docs/PREREG.md (7d9205e); docs/STATE.md (687983a); git tag objects and git ls-tree (the tag objects themselves)</w:t>
+              <w:t xml:space="preserve">docs/PREREG.md (7d9205e); docs/STATE.md (2048f36); git tag objects and git ls-tree (the tag objects themselves)</w:t>
             </w:r>
           </w:p>
         </w:tc>
@@ -12519,7 +12519,7 @@
               <w:pStyle w:val="Compact"/>
             </w:pPr>
             <w:r>
-              <w:t xml:space="preserve">docs/HELDOUT.md (4d2c02c); docs/PREREG.md (7d9205e); docs/STATE.md (687983a); git tag objects and git ls-tree (the tag objects themselves)</w:t>
+              <w:t xml:space="preserve">docs/HELDOUT.md (4d2c02c); docs/PREREG.md (7d9205e); docs/STATE.md (2048f36); git tag objects and git ls-tree (the tag objects themselves)</w:t>
             </w:r>
           </w:p>
         </w:tc>
@@ -12567,7 +12567,7 @@
               <w:pStyle w:val="Compact"/>
             </w:pPr>
             <w:r>
-              <w:t xml:space="preserve">docs/STATE.md (687983a); docs/manuscript/REFERENCES_CHECK.md (6df6718); docs/manuscript/REVIEW_draft1.md (48931d2); docs/preprint/preprint.md (8bed48b); docs/preprint/references.bib (8bed48b)</w:t>
+              <w:t xml:space="preserve">docs/STATE.md (2048f36); docs/manuscript/REFERENCES_CHECK.md (6df6718); docs/manuscript/REVIEW_draft1.md (48931d2); docs/preprint/preprint.md (8bed48b); docs/preprint/references.bib (8bed48b)</w:t>
             </w:r>
           </w:p>
         </w:tc>

</xml_diff>